<commit_message>
Agora sim, removendo arquivo grande do commit
</commit_message>
<xml_diff>
--- a/erro no seq.docx
+++ b/erro no seq.docx
@@ -3,31 +3,410 @@
 <w:document xmlns:wpc="http://schemas.microsoft.com/office/word/2010/wordprocessingCanvas" xmlns:mc="http://schemas.openxmlformats.org/markup-compatibility/2006" xmlns:o="urn:schemas-microsoft-com:office:office" xmlns:r="http://schemas.openxmlformats.org/officeDocument/2006/relationships" xmlns:m="http://schemas.openxmlformats.org/officeDocument/2006/math" xmlns:v="urn:schemas-microsoft-com:vml" xmlns:wp14="http://schemas.microsoft.com/office/word/2010/wordprocessingDrawing" xmlns:wp="http://schemas.openxmlformats.org/drawingml/2006/wordprocessingDrawing" xmlns:w10="urn:schemas-microsoft-com:office:word" xmlns:w="http://schemas.openxmlformats.org/wordprocessingml/2006/main" xmlns:w14="http://schemas.microsoft.com/office/word/2010/wordml" xmlns:wpg="http://schemas.microsoft.com/office/word/2010/wordprocessingGroup" xmlns:wpi="http://schemas.microsoft.com/office/word/2010/wordprocessingInk" xmlns:wne="http://schemas.microsoft.com/office/word/2006/wordml" xmlns:wps="http://schemas.microsoft.com/office/word/2010/wordprocessingShape" mc:Ignorable="w14 wp14">
   <w:body>
     <w:p>
-      <w:r>
-        <w:t>Na tabela 000_</w:t>
+      <w:pPr>
+        <w:pStyle w:val="NormalWeb"/>
+        <w:rPr>
+          <w:rFonts w:ascii="Arial" w:hAnsi="Arial" w:cs="Arial"/>
+        </w:rPr>
+      </w:pPr>
+      <w:r>
+        <w:rPr>
+          <w:rFonts w:ascii="Arial" w:hAnsi="Arial" w:cs="Arial"/>
+        </w:rPr>
+        <w:t xml:space="preserve">No teste de automação da </w:t>
+      </w:r>
+      <w:proofErr w:type="spellStart"/>
+      <w:r>
+        <w:rPr>
+          <w:rStyle w:val="CdigoHTML"/>
+          <w:rFonts w:ascii="Arial" w:hAnsi="Arial" w:cs="Arial"/>
+          <w:sz w:val="24"/>
+          <w:szCs w:val="24"/>
+        </w:rPr>
+        <w:t>tbl_pessoal</w:t>
+      </w:r>
+      <w:proofErr w:type="spellEnd"/>
+      <w:r>
+        <w:rPr>
+          <w:rFonts w:ascii="Arial" w:hAnsi="Arial" w:cs="Arial"/>
+        </w:rPr>
+        <w:t xml:space="preserve"> (fita espelho), foram encontradas divergências no campo </w:t>
+      </w:r>
+      <w:r>
+        <w:rPr>
+          <w:rFonts w:ascii="Arial" w:hAnsi="Arial" w:cs="Arial"/>
+          <w:b/>
+          <w:bCs/>
+        </w:rPr>
+        <w:t>Escolaridade</w:t>
+      </w:r>
+      <w:r>
+        <w:rPr>
+          <w:rFonts w:ascii="Arial" w:hAnsi="Arial" w:cs="Arial"/>
+        </w:rPr>
+        <w:t xml:space="preserve"> em </w:t>
       </w:r>
       <w:proofErr w:type="gramStart"/>
       <w:r>
-        <w:t>PgtoIncentivoQualificacao</w:t>
+        <w:rPr>
+          <w:rFonts w:ascii="Arial" w:hAnsi="Arial" w:cs="Arial"/>
+        </w:rPr>
+        <w:t>8</w:t>
       </w:r>
       <w:proofErr w:type="gramEnd"/>
       <w:r>
-        <w:t xml:space="preserve"> foi feito alteração no filtro no campo SEQ que antes tratava somente a Sequencia 0  fazendo com que alguns registros não entraram nas consultas  o procedimento foi  colocar no filt</w:t>
+        <w:rPr>
+          <w:rFonts w:ascii="Arial" w:hAnsi="Arial" w:cs="Arial"/>
+        </w:rPr>
+        <w:t xml:space="preserve"> casos.</w:t>
+      </w:r>
+    </w:p>
+    <w:p>
+      <w:pPr>
+        <w:pStyle w:val="NormalWeb"/>
+        <w:rPr>
+          <w:rFonts w:ascii="Arial" w:hAnsi="Arial" w:cs="Arial"/>
+        </w:rPr>
+      </w:pPr>
+      <w:r>
+        <w:rPr>
+          <w:rFonts w:ascii="Arial" w:hAnsi="Arial" w:cs="Arial"/>
+        </w:rPr>
+        <w:t>Identificamos que o código de escolaridade e o código de titulação são iguais, o que ativa a regra do Incentivo à Qualificação (IQ).</w:t>
+      </w:r>
+    </w:p>
+    <w:p>
+      <w:pPr>
+        <w:pStyle w:val="NormalWeb"/>
+        <w:numPr>
+          <w:ilvl w:val="0"/>
+          <w:numId w:val="1"/>
+        </w:numPr>
+        <w:rPr>
+          <w:rFonts w:ascii="Arial" w:hAnsi="Arial" w:cs="Arial"/>
+        </w:rPr>
+      </w:pPr>
+      <w:r>
+        <w:rPr>
+          <w:rFonts w:ascii="Arial" w:hAnsi="Arial" w:cs="Arial"/>
+        </w:rPr>
+        <w:t xml:space="preserve">Ao analisar a tabela de vencimentos, vimos que todos os </w:t>
+      </w:r>
+      <w:proofErr w:type="gramStart"/>
+      <w:r>
+        <w:rPr>
+          <w:rFonts w:ascii="Arial" w:hAnsi="Arial" w:cs="Arial"/>
+        </w:rPr>
+        <w:t>8</w:t>
+      </w:r>
+      <w:proofErr w:type="gramEnd"/>
+      <w:r>
+        <w:rPr>
+          <w:rFonts w:ascii="Arial" w:hAnsi="Arial" w:cs="Arial"/>
+        </w:rPr>
+        <w:t xml:space="preserve"> casos possuem IQ.</w:t>
+      </w:r>
+    </w:p>
+    <w:p>
+      <w:pPr>
+        <w:pStyle w:val="NormalWeb"/>
+        <w:numPr>
+          <w:ilvl w:val="0"/>
+          <w:numId w:val="1"/>
+        </w:numPr>
+        <w:rPr>
+          <w:rFonts w:ascii="Arial" w:hAnsi="Arial" w:cs="Arial"/>
+        </w:rPr>
+      </w:pPr>
+      <w:r>
+        <w:rPr>
+          <w:rFonts w:ascii="Arial" w:hAnsi="Arial" w:cs="Arial"/>
+        </w:rPr>
+        <w:t xml:space="preserve">A divergência ocorre porque, nesses registros, o campo </w:t>
+      </w:r>
+      <w:r>
+        <w:rPr>
+          <w:rFonts w:ascii="Arial" w:hAnsi="Arial" w:cs="Arial"/>
+          <w:b/>
+          <w:bCs/>
+        </w:rPr>
+        <w:t>SEQ</w:t>
+      </w:r>
+      <w:r>
+        <w:rPr>
+          <w:rFonts w:ascii="Arial" w:hAnsi="Arial" w:cs="Arial"/>
+        </w:rPr>
+        <w:t xml:space="preserve"> está preenchido como </w:t>
+      </w:r>
+      <w:proofErr w:type="gramStart"/>
+      <w:r>
+        <w:rPr>
+          <w:rStyle w:val="CdigoHTML"/>
+          <w:rFonts w:ascii="Arial" w:hAnsi="Arial" w:cs="Arial"/>
+          <w:sz w:val="24"/>
+          <w:szCs w:val="24"/>
+        </w:rPr>
+        <w:t>1</w:t>
+      </w:r>
+      <w:proofErr w:type="gramEnd"/>
+      <w:r>
+        <w:rPr>
+          <w:rFonts w:ascii="Arial" w:hAnsi="Arial" w:cs="Arial"/>
+        </w:rPr>
+        <w:t xml:space="preserve">, enquanto nos demais está como </w:t>
+      </w:r>
+      <w:r>
+        <w:rPr>
+          <w:rStyle w:val="CdigoHTML"/>
+          <w:rFonts w:ascii="Arial" w:hAnsi="Arial" w:cs="Arial"/>
+          <w:sz w:val="24"/>
+          <w:szCs w:val="24"/>
+        </w:rPr>
+        <w:t>0</w:t>
+      </w:r>
+      <w:r>
+        <w:rPr>
+          <w:rFonts w:ascii="Arial" w:hAnsi="Arial" w:cs="Arial"/>
+        </w:rPr>
+        <w:t>.</w:t>
+      </w:r>
+    </w:p>
+    <w:p>
+      <w:pPr>
+        <w:pStyle w:val="NormalWeb"/>
+        <w:rPr>
+          <w:rFonts w:ascii="Arial" w:hAnsi="Arial" w:cs="Arial"/>
+        </w:rPr>
+      </w:pPr>
+      <w:r>
+        <w:rPr>
+          <w:rFonts w:ascii="Arial" w:hAnsi="Arial" w:cs="Arial"/>
+          <w:b/>
+          <w:bCs/>
+        </w:rPr>
+        <w:t>Solução:</w:t>
+      </w:r>
+      <w:r>
+        <w:rPr>
+          <w:rFonts w:ascii="Arial" w:hAnsi="Arial" w:cs="Arial"/>
+        </w:rPr>
+        <w:t xml:space="preserve"> Ajustar o filtro do campo </w:t>
+      </w:r>
+      <w:r>
+        <w:rPr>
+          <w:rFonts w:ascii="Arial" w:hAnsi="Arial" w:cs="Arial"/>
+          <w:b/>
+          <w:bCs/>
+        </w:rPr>
+        <w:t>SEQ</w:t>
+      </w:r>
+      <w:r>
+        <w:rPr>
+          <w:rFonts w:ascii="Arial" w:hAnsi="Arial" w:cs="Arial"/>
+        </w:rPr>
+        <w:t xml:space="preserve"> na produção da fita espelho para aceitar os valores </w:t>
+      </w:r>
+      <w:proofErr w:type="gramStart"/>
+      <w:r>
+        <w:rPr>
+          <w:rStyle w:val="CdigoHTML"/>
+          <w:rFonts w:ascii="Arial" w:hAnsi="Arial" w:cs="Arial"/>
+          <w:sz w:val="24"/>
+          <w:szCs w:val="24"/>
+        </w:rPr>
+        <w:t>0</w:t>
+      </w:r>
+      <w:proofErr w:type="gramEnd"/>
+      <w:r>
+        <w:rPr>
+          <w:rFonts w:ascii="Arial" w:hAnsi="Arial" w:cs="Arial"/>
+        </w:rPr>
+        <w:t xml:space="preserve"> ou </w:t>
+      </w:r>
+      <w:r>
+        <w:rPr>
+          <w:rStyle w:val="CdigoHTML"/>
+          <w:rFonts w:ascii="Arial" w:hAnsi="Arial" w:cs="Arial"/>
+          <w:sz w:val="24"/>
+          <w:szCs w:val="24"/>
+        </w:rPr>
+        <w:t>1</w:t>
+      </w:r>
+      <w:r>
+        <w:rPr>
+          <w:rFonts w:ascii="Arial" w:hAnsi="Arial" w:cs="Arial"/>
+        </w:rPr>
+        <w:t>.</w:t>
       </w:r>
       <w:bookmarkStart w:id="0" w:name="_GoBack"/>
       <w:bookmarkEnd w:id="0"/>
-      <w:r>
-        <w:t>ro 0 1 para que fosse corrigido</w:t>
-      </w:r>
     </w:p>
+    <w:p/>
     <w:sectPr>
       <w:pgSz w:w="11906" w:h="16838"/>
-      <w:pgMar w:top="1417" w:right="1701" w:bottom="1417" w:left="1701" w:header="708" w:footer="708" w:gutter="0"/>
+      <w:pgMar w:top="720" w:right="720" w:bottom="720" w:left="720" w:header="708" w:footer="708" w:gutter="0"/>
       <w:cols w:space="708"/>
       <w:docGrid w:linePitch="360"/>
     </w:sectPr>
   </w:body>
 </w:document>
+</file>
+
+<file path=word/numbering.xml><?xml version="1.0" encoding="utf-8"?>
+<w:numbering xmlns:wpc="http://schemas.microsoft.com/office/word/2010/wordprocessingCanvas" xmlns:mc="http://schemas.openxmlformats.org/markup-compatibility/2006" xmlns:o="urn:schemas-microsoft-com:office:office" xmlns:r="http://schemas.openxmlformats.org/officeDocument/2006/relationships" xmlns:m="http://schemas.openxmlformats.org/officeDocument/2006/math" xmlns:v="urn:schemas-microsoft-com:vml" xmlns:wp14="http://schemas.microsoft.com/office/word/2010/wordprocessingDrawing" xmlns:wp="http://schemas.openxmlformats.org/drawingml/2006/wordprocessingDrawing" xmlns:w10="urn:schemas-microsoft-com:office:word" xmlns:w="http://schemas.openxmlformats.org/wordprocessingml/2006/main" xmlns:w14="http://schemas.microsoft.com/office/word/2010/wordml" xmlns:wpg="http://schemas.microsoft.com/office/word/2010/wordprocessingGroup" xmlns:wpi="http://schemas.microsoft.com/office/word/2010/wordprocessingInk" xmlns:wne="http://schemas.microsoft.com/office/word/2006/wordml" xmlns:wps="http://schemas.microsoft.com/office/word/2010/wordprocessingShape" mc:Ignorable="w14 wp14">
+  <w:abstractNum w:abstractNumId="0">
+    <w:nsid w:val="18953D69"/>
+    <w:multiLevelType w:val="multilevel"/>
+    <w:tmpl w:val="41C8057C"/>
+    <w:lvl w:ilvl="0">
+      <w:start w:val="1"/>
+      <w:numFmt w:val="bullet"/>
+      <w:lvlText w:val=""/>
+      <w:lvlJc w:val="left"/>
+      <w:pPr>
+        <w:tabs>
+          <w:tab w:val="num" w:pos="720"/>
+        </w:tabs>
+        <w:ind w:left="720" w:hanging="360"/>
+      </w:pPr>
+      <w:rPr>
+        <w:rFonts w:ascii="Symbol" w:hAnsi="Symbol" w:hint="default"/>
+        <w:sz w:val="20"/>
+      </w:rPr>
+    </w:lvl>
+    <w:lvl w:ilvl="1" w:tentative="1">
+      <w:start w:val="1"/>
+      <w:numFmt w:val="bullet"/>
+      <w:lvlText w:val="o"/>
+      <w:lvlJc w:val="left"/>
+      <w:pPr>
+        <w:tabs>
+          <w:tab w:val="num" w:pos="1440"/>
+        </w:tabs>
+        <w:ind w:left="1440" w:hanging="360"/>
+      </w:pPr>
+      <w:rPr>
+        <w:rFonts w:ascii="Courier New" w:hAnsi="Courier New" w:hint="default"/>
+        <w:sz w:val="20"/>
+      </w:rPr>
+    </w:lvl>
+    <w:lvl w:ilvl="2" w:tentative="1">
+      <w:start w:val="1"/>
+      <w:numFmt w:val="bullet"/>
+      <w:lvlText w:val=""/>
+      <w:lvlJc w:val="left"/>
+      <w:pPr>
+        <w:tabs>
+          <w:tab w:val="num" w:pos="2160"/>
+        </w:tabs>
+        <w:ind w:left="2160" w:hanging="360"/>
+      </w:pPr>
+      <w:rPr>
+        <w:rFonts w:ascii="Wingdings" w:hAnsi="Wingdings" w:hint="default"/>
+        <w:sz w:val="20"/>
+      </w:rPr>
+    </w:lvl>
+    <w:lvl w:ilvl="3" w:tentative="1">
+      <w:start w:val="1"/>
+      <w:numFmt w:val="bullet"/>
+      <w:lvlText w:val=""/>
+      <w:lvlJc w:val="left"/>
+      <w:pPr>
+        <w:tabs>
+          <w:tab w:val="num" w:pos="2880"/>
+        </w:tabs>
+        <w:ind w:left="2880" w:hanging="360"/>
+      </w:pPr>
+      <w:rPr>
+        <w:rFonts w:ascii="Wingdings" w:hAnsi="Wingdings" w:hint="default"/>
+        <w:sz w:val="20"/>
+      </w:rPr>
+    </w:lvl>
+    <w:lvl w:ilvl="4" w:tentative="1">
+      <w:start w:val="1"/>
+      <w:numFmt w:val="bullet"/>
+      <w:lvlText w:val=""/>
+      <w:lvlJc w:val="left"/>
+      <w:pPr>
+        <w:tabs>
+          <w:tab w:val="num" w:pos="3600"/>
+        </w:tabs>
+        <w:ind w:left="3600" w:hanging="360"/>
+      </w:pPr>
+      <w:rPr>
+        <w:rFonts w:ascii="Wingdings" w:hAnsi="Wingdings" w:hint="default"/>
+        <w:sz w:val="20"/>
+      </w:rPr>
+    </w:lvl>
+    <w:lvl w:ilvl="5" w:tentative="1">
+      <w:start w:val="1"/>
+      <w:numFmt w:val="bullet"/>
+      <w:lvlText w:val=""/>
+      <w:lvlJc w:val="left"/>
+      <w:pPr>
+        <w:tabs>
+          <w:tab w:val="num" w:pos="4320"/>
+        </w:tabs>
+        <w:ind w:left="4320" w:hanging="360"/>
+      </w:pPr>
+      <w:rPr>
+        <w:rFonts w:ascii="Wingdings" w:hAnsi="Wingdings" w:hint="default"/>
+        <w:sz w:val="20"/>
+      </w:rPr>
+    </w:lvl>
+    <w:lvl w:ilvl="6" w:tentative="1">
+      <w:start w:val="1"/>
+      <w:numFmt w:val="bullet"/>
+      <w:lvlText w:val=""/>
+      <w:lvlJc w:val="left"/>
+      <w:pPr>
+        <w:tabs>
+          <w:tab w:val="num" w:pos="5040"/>
+        </w:tabs>
+        <w:ind w:left="5040" w:hanging="360"/>
+      </w:pPr>
+      <w:rPr>
+        <w:rFonts w:ascii="Wingdings" w:hAnsi="Wingdings" w:hint="default"/>
+        <w:sz w:val="20"/>
+      </w:rPr>
+    </w:lvl>
+    <w:lvl w:ilvl="7" w:tentative="1">
+      <w:start w:val="1"/>
+      <w:numFmt w:val="bullet"/>
+      <w:lvlText w:val=""/>
+      <w:lvlJc w:val="left"/>
+      <w:pPr>
+        <w:tabs>
+          <w:tab w:val="num" w:pos="5760"/>
+        </w:tabs>
+        <w:ind w:left="5760" w:hanging="360"/>
+      </w:pPr>
+      <w:rPr>
+        <w:rFonts w:ascii="Wingdings" w:hAnsi="Wingdings" w:hint="default"/>
+        <w:sz w:val="20"/>
+      </w:rPr>
+    </w:lvl>
+    <w:lvl w:ilvl="8" w:tentative="1">
+      <w:start w:val="1"/>
+      <w:numFmt w:val="bullet"/>
+      <w:lvlText w:val=""/>
+      <w:lvlJc w:val="left"/>
+      <w:pPr>
+        <w:tabs>
+          <w:tab w:val="num" w:pos="6480"/>
+        </w:tabs>
+        <w:ind w:left="6480" w:hanging="360"/>
+      </w:pPr>
+      <w:rPr>
+        <w:rFonts w:ascii="Wingdings" w:hAnsi="Wingdings" w:hint="default"/>
+        <w:sz w:val="20"/>
+      </w:rPr>
+    </w:lvl>
+  </w:abstractNum>
+  <w:num w:numId="1">
+    <w:abstractNumId w:val="0"/>
+  </w:num>
+</w:numbering>
 </file>
 
 <file path=word/styles.xml><?xml version="1.0" encoding="utf-8"?>
@@ -217,6 +596,36 @@
     <w:semiHidden/>
     <w:unhideWhenUsed/>
   </w:style>
+  <w:style w:type="paragraph" w:styleId="NormalWeb">
+    <w:name w:val="Normal (Web)"/>
+    <w:basedOn w:val="Normal"/>
+    <w:uiPriority w:val="99"/>
+    <w:semiHidden/>
+    <w:unhideWhenUsed/>
+    <w:rsid w:val="007D41E4"/>
+    <w:pPr>
+      <w:spacing w:before="100" w:beforeAutospacing="1" w:after="100" w:afterAutospacing="1" w:line="240" w:lineRule="auto"/>
+    </w:pPr>
+    <w:rPr>
+      <w:rFonts w:ascii="Times New Roman" w:eastAsia="Times New Roman" w:hAnsi="Times New Roman" w:cs="Times New Roman"/>
+      <w:sz w:val="24"/>
+      <w:szCs w:val="24"/>
+      <w:lang w:eastAsia="pt-BR"/>
+    </w:rPr>
+  </w:style>
+  <w:style w:type="character" w:styleId="CdigoHTML">
+    <w:name w:val="HTML Code"/>
+    <w:basedOn w:val="Fontepargpadro"/>
+    <w:uiPriority w:val="99"/>
+    <w:semiHidden/>
+    <w:unhideWhenUsed/>
+    <w:rsid w:val="007D41E4"/>
+    <w:rPr>
+      <w:rFonts w:ascii="Courier New" w:eastAsia="Times New Roman" w:hAnsi="Courier New" w:cs="Courier New"/>
+      <w:sz w:val="20"/>
+      <w:szCs w:val="20"/>
+    </w:rPr>
+  </w:style>
 </w:styles>
 </file>
 
@@ -406,6 +815,36 @@
     <w:uiPriority w:val="99"/>
     <w:semiHidden/>
     <w:unhideWhenUsed/>
+  </w:style>
+  <w:style w:type="paragraph" w:styleId="NormalWeb">
+    <w:name w:val="Normal (Web)"/>
+    <w:basedOn w:val="Normal"/>
+    <w:uiPriority w:val="99"/>
+    <w:semiHidden/>
+    <w:unhideWhenUsed/>
+    <w:rsid w:val="007D41E4"/>
+    <w:pPr>
+      <w:spacing w:before="100" w:beforeAutospacing="1" w:after="100" w:afterAutospacing="1" w:line="240" w:lineRule="auto"/>
+    </w:pPr>
+    <w:rPr>
+      <w:rFonts w:ascii="Times New Roman" w:eastAsia="Times New Roman" w:hAnsi="Times New Roman" w:cs="Times New Roman"/>
+      <w:sz w:val="24"/>
+      <w:szCs w:val="24"/>
+      <w:lang w:eastAsia="pt-BR"/>
+    </w:rPr>
+  </w:style>
+  <w:style w:type="character" w:styleId="CdigoHTML">
+    <w:name w:val="HTML Code"/>
+    <w:basedOn w:val="Fontepargpadro"/>
+    <w:uiPriority w:val="99"/>
+    <w:semiHidden/>
+    <w:unhideWhenUsed/>
+    <w:rsid w:val="007D41E4"/>
+    <w:rPr>
+      <w:rFonts w:ascii="Courier New" w:eastAsia="Times New Roman" w:hAnsi="Courier New" w:cs="Courier New"/>
+      <w:sz w:val="20"/>
+      <w:szCs w:val="20"/>
+    </w:rPr>
   </w:style>
 </w:styles>
 </file>

</xml_diff>